<commit_message>
updated COS and Next Steps templates and code
</commit_message>
<xml_diff>
--- a/docassemble/VTSmallClaimsComplaint/data/templates/small_claims_complaint_next_steps.docx
+++ b/docassemble/VTSmallClaimsComplaint/data/templates/small_claims_complaint_next_steps.docx
@@ -92,8 +92,13 @@
       <w:r>
         <w:t xml:space="preserve"> </w:t>
       </w:r>
-      <w:r>
-        <w:t>Now l</w:t>
+      <w:proofErr w:type="gramStart"/>
+      <w:r>
+        <w:t>Now</w:t>
+      </w:r>
+      <w:proofErr w:type="gramEnd"/>
+      <w:r>
+        <w:t xml:space="preserve"> l</w:t>
       </w:r>
       <w:r>
         <w:t>earn what to do next.</w:t>
@@ -125,13 +130,28 @@
         <w:t>Download all the items in the VTCourtForms download screen.</w:t>
       </w:r>
       <w:r>
-        <w:t xml:space="preserve"> You will hold on to </w:t>
-      </w:r>
-      <w:r>
-        <w:t>the blank</w:t>
-      </w:r>
-      <w:r>
-        <w:t xml:space="preserve"> documents for later in the process.</w:t>
+        <w:t xml:space="preserve"> </w:t>
+      </w:r>
+      <w:r>
+        <w:t>Put aside</w:t>
+      </w:r>
+      <w:r>
+        <w:t xml:space="preserve"> </w:t>
+      </w:r>
+      <w:r>
+        <w:t>your Certificate of Service and the</w:t>
+      </w:r>
+      <w:r>
+        <w:t xml:space="preserve"> blank</w:t>
+      </w:r>
+      <w:r>
+        <w:t xml:space="preserve"> documents </w:t>
+      </w:r>
+      <w:r>
+        <w:t xml:space="preserve">for the defendant </w:t>
+      </w:r>
+      <w:r>
+        <w:t>for later in the process.</w:t>
       </w:r>
     </w:p>
     <w:p>
@@ -228,14 +248,10 @@
         <w:t xml:space="preserve">f you get public assistance or have a low income, </w:t>
       </w:r>
       <w:r>
-        <w:rPr>
-          <w:b/>
-          <w:bCs/>
-        </w:rPr>
-        <w:t>you can ask the court to waive the fees</w:t>
-      </w:r>
-      <w:r>
-        <w:t xml:space="preserve">. </w:t>
+        <w:t>you can ask the court to waive the fees.</w:t>
+      </w:r>
+      <w:r>
+        <w:t xml:space="preserve"> </w:t>
       </w:r>
       <w:r>
         <w:t xml:space="preserve">You can use </w:t>
@@ -316,7 +332,15 @@
         </w:numPr>
       </w:pPr>
       <w:r>
-        <w:t>the court finds you can't pay the fee without expending resources needed to support you and your dependents</w:t>
+        <w:t xml:space="preserve">the court finds you can't pay the fee without expending </w:t>
+      </w:r>
+      <w:proofErr w:type="gramStart"/>
+      <w:r>
+        <w:t>resources</w:t>
+      </w:r>
+      <w:proofErr w:type="gramEnd"/>
+      <w:r>
+        <w:t xml:space="preserve"> needed to support you and your dependents</w:t>
       </w:r>
       <w:r>
         <w:t>.</w:t>
@@ -538,6 +562,7 @@
         <w:ind w:left="720"/>
       </w:pPr>
       <w:r>
+        <w:lastRenderedPageBreak/>
         <w:t>e</w:t>
       </w:r>
       <w:r>
@@ -549,8 +574,23 @@
     </w:p>
     <w:p>
       <w:r>
-        <w:lastRenderedPageBreak/>
-        <w:t>If you email the packet, be sure to call the courthouse to be sure they got it.</w:t>
+        <w:t xml:space="preserve">If you </w:t>
+      </w:r>
+      <w:proofErr w:type="gramStart"/>
+      <w:r>
+        <w:t>email</w:t>
+      </w:r>
+      <w:proofErr w:type="gramEnd"/>
+      <w:r>
+        <w:t xml:space="preserve"> the packet, be sure to call the courthouse to be sure they </w:t>
+      </w:r>
+      <w:proofErr w:type="gramStart"/>
+      <w:r>
+        <w:t>got</w:t>
+      </w:r>
+      <w:proofErr w:type="gramEnd"/>
+      <w:r>
+        <w:t xml:space="preserve"> it.</w:t>
       </w:r>
     </w:p>
     <w:p>
@@ -630,8 +670,13 @@
         <w:t xml:space="preserve"> the court </w:t>
       </w:r>
       <w:r>
-        <w:t>where you said your case is</w:t>
-      </w:r>
+        <w:t xml:space="preserve">where you said your case </w:t>
+      </w:r>
+      <w:proofErr w:type="gramStart"/>
+      <w:r>
+        <w:t>is</w:t>
+      </w:r>
+      <w:proofErr w:type="gramEnd"/>
       <w:r>
         <w:t>:</w:t>
       </w:r>
@@ -839,7 +884,13 @@
           <w:rPr>
             <w:rStyle w:val="Hyperlink"/>
           </w:rPr>
-          <w:t>www.vermontjudiciary.org/self-help/filing-procedures</w:t>
+          <w:t>www.vermontjudiciary.org/self-</w:t>
+        </w:r>
+        <w:r>
+          <w:rPr>
+            <w:rStyle w:val="Hyperlink"/>
+          </w:rPr>
+          <w:t>help/filing-procedures</w:t>
         </w:r>
       </w:hyperlink>
       <w:r>
@@ -863,7 +914,36 @@
         <w:pStyle w:val="Heading2"/>
       </w:pPr>
       <w:r>
-        <w:t>The court sends papers to you</w:t>
+        <w:t>Wait for</w:t>
+      </w:r>
+      <w:r>
+        <w:t xml:space="preserve"> </w:t>
+      </w:r>
+      <w:r>
+        <w:t xml:space="preserve">the </w:t>
+      </w:r>
+      <w:r>
+        <w:t xml:space="preserve">court </w:t>
+      </w:r>
+      <w:r>
+        <w:t xml:space="preserve">to </w:t>
+      </w:r>
+      <w:r>
+        <w:t xml:space="preserve">send </w:t>
+      </w:r>
+      <w:proofErr w:type="gramStart"/>
+      <w:r>
+        <w:t>papers</w:t>
+      </w:r>
+      <w:proofErr w:type="gramEnd"/>
+      <w:r>
+        <w:t xml:space="preserve"> </w:t>
+      </w:r>
+      <w:r>
+        <w:t xml:space="preserve">back </w:t>
+      </w:r>
+      <w:r>
+        <w:t>to you</w:t>
       </w:r>
     </w:p>
     <w:p>
@@ -900,7 +980,43 @@
         <w:rPr>
           <w:lang w:val="en-GB"/>
         </w:rPr>
-        <w:t xml:space="preserve"> you a Summons and Complaint that has a case number / docket number on it.</w:t>
+        <w:t xml:space="preserve"> you a Summons and </w:t>
+      </w:r>
+      <w:r>
+        <w:rPr>
+          <w:lang w:val="en-GB"/>
+        </w:rPr>
+        <w:t xml:space="preserve">a </w:t>
+      </w:r>
+      <w:r>
+        <w:rPr>
+          <w:lang w:val="en-GB"/>
+        </w:rPr>
+        <w:t xml:space="preserve">Complaint that </w:t>
+      </w:r>
+      <w:r>
+        <w:rPr>
+          <w:lang w:val="en-GB"/>
+        </w:rPr>
+        <w:t>have</w:t>
+      </w:r>
+      <w:r>
+        <w:rPr>
+          <w:lang w:val="en-GB"/>
+        </w:rPr>
+        <w:t xml:space="preserve"> a case number / docket number on </w:t>
+      </w:r>
+      <w:r>
+        <w:rPr>
+          <w:lang w:val="en-GB"/>
+        </w:rPr>
+        <w:t>them</w:t>
+      </w:r>
+      <w:r>
+        <w:rPr>
+          <w:lang w:val="en-GB"/>
+        </w:rPr>
+        <w:t>.</w:t>
       </w:r>
       <w:r>
         <w:rPr>
@@ -975,7 +1091,25 @@
         <w:rPr>
           <w:lang w:val="en-GB"/>
         </w:rPr>
-        <w:t>Next, you must “serve</w:t>
+        <w:t xml:space="preserve">After you get </w:t>
+      </w:r>
+      <w:r>
+        <w:rPr>
+          <w:lang w:val="en-GB"/>
+        </w:rPr>
+        <w:t>the reply</w:t>
+      </w:r>
+      <w:r>
+        <w:rPr>
+          <w:lang w:val="en-GB"/>
+        </w:rPr>
+        <w:t xml:space="preserve"> from the court</w:t>
+      </w:r>
+      <w:r>
+        <w:rPr>
+          <w:lang w:val="en-GB"/>
+        </w:rPr>
+        <w:t>, you must “serve</w:t>
       </w:r>
       <w:r>
         <w:rPr>
@@ -1091,7 +1225,19 @@
         <w:rPr>
           <w:lang w:val="en-GB"/>
         </w:rPr>
-        <w:t xml:space="preserve"> form you got from the court (with the case number on it)</w:t>
+        <w:t xml:space="preserve"> you got from the court (with the case number on </w:t>
+      </w:r>
+      <w:r>
+        <w:rPr>
+          <w:lang w:val="en-GB"/>
+        </w:rPr>
+        <w:t>them</w:t>
+      </w:r>
+      <w:r>
+        <w:rPr>
+          <w:lang w:val="en-GB"/>
+        </w:rPr>
+        <w:t>)</w:t>
       </w:r>
     </w:p>
     <w:p>
@@ -1123,6 +1269,12 @@
         </w:rPr>
         <w:t>Small Claims Information and Instructions for Defendant handout</w:t>
       </w:r>
+      <w:r>
+        <w:rPr>
+          <w:lang w:val="en-GB"/>
+        </w:rPr>
+        <w:t xml:space="preserve"> (for the defendant to read)</w:t>
+      </w:r>
     </w:p>
     <w:p>
       <w:pPr>
@@ -1193,6 +1345,7 @@
         <w:rPr>
           <w:lang w:val="en-GB"/>
         </w:rPr>
+        <w:lastRenderedPageBreak/>
         <w:t>a blank small claims Certificate of Service form</w:t>
       </w:r>
       <w:r>
@@ -1205,48 +1358,7 @@
         <w:rPr>
           <w:lang w:val="en-GB"/>
         </w:rPr>
-        <w:t>:</w:t>
-      </w:r>
-      <w:r>
-        <w:rPr>
-          <w:lang w:val="en-GB"/>
-        </w:rPr>
-        <w:t xml:space="preserve"> </w:t>
-      </w:r>
-      <w:hyperlink r:id="rId17" w:history="1">
-        <w:r>
-          <w:rPr>
-            <w:rStyle w:val="Hyperlink"/>
-            <w:lang w:val="en-GB"/>
-          </w:rPr>
-          <w:t>vermontjud</w:t>
-        </w:r>
-        <w:r>
-          <w:rPr>
-            <w:rStyle w:val="Hyperlink"/>
-            <w:lang w:val="en-GB"/>
-          </w:rPr>
-          <w:t>i</w:t>
-        </w:r>
-        <w:r>
-          <w:rPr>
-            <w:rStyle w:val="Hyperlink"/>
-            <w:lang w:val="en-GB"/>
-          </w:rPr>
-          <w:t>ciary.org/media/12</w:t>
-        </w:r>
-      </w:hyperlink>
-      <w:r>
-        <w:rPr>
-          <w:lang w:val="en-GB"/>
-        </w:rPr>
-        <w:t xml:space="preserve"> </w:t>
-      </w:r>
-      <w:r>
-        <w:rPr>
-          <w:lang w:val="en-GB"/>
-        </w:rPr>
-        <w:t>)</w:t>
+        <w:t>).</w:t>
       </w:r>
     </w:p>
     <w:p>
@@ -1276,7 +1388,6 @@
         <w:rPr>
           <w:lang w:val="en-GB"/>
         </w:rPr>
-        <w:lastRenderedPageBreak/>
         <w:t>Use first-class mail</w:t>
       </w:r>
       <w:r>
@@ -1424,7 +1535,7 @@
       <w:r>
         <w:t xml:space="preserve">: </w:t>
       </w:r>
-      <w:hyperlink r:id="rId18" w:anchor="departments" w:history="1">
+      <w:hyperlink r:id="rId17" w:anchor="departments" w:history="1">
         <w:r>
           <w:rPr>
             <w:rStyle w:val="Hyperlink"/>
@@ -1525,10 +1636,7 @@
         <w:t>disputes the claim</w:t>
       </w:r>
       <w:r>
-        <w:t xml:space="preserve">, the court will mail both you and the defendant a Notice of </w:t>
-      </w:r>
-      <w:r>
-        <w:t xml:space="preserve">Hearing. </w:t>
+        <w:t xml:space="preserve">, the court will mail both you and the defendant a Notice of Hearing. </w:t>
       </w:r>
       <w:r>
         <w:t>The</w:t>
@@ -1568,7 +1676,31 @@
     </w:p>
     <w:p>
       <w:r>
-        <w:t xml:space="preserve">At the hearing, you should come prepared to present your side of the case. You should bring any people, papers or anything else that might help your case. If you bring papers, you should bring a copy for the </w:t>
+        <w:t xml:space="preserve">At the hearing, you should come prepared to present your side of the case. You should bring </w:t>
+      </w:r>
+      <w:proofErr w:type="gramStart"/>
+      <w:r>
+        <w:t>any</w:t>
+      </w:r>
+      <w:proofErr w:type="gramEnd"/>
+      <w:r>
+        <w:t xml:space="preserve"> people, </w:t>
+      </w:r>
+      <w:proofErr w:type="gramStart"/>
+      <w:r>
+        <w:t>papers</w:t>
+      </w:r>
+      <w:proofErr w:type="gramEnd"/>
+      <w:r>
+        <w:t xml:space="preserve"> or anything else that might help your case. If you bring </w:t>
+      </w:r>
+      <w:proofErr w:type="gramStart"/>
+      <w:r>
+        <w:t>papers</w:t>
+      </w:r>
+      <w:proofErr w:type="gramEnd"/>
+      <w:r>
+        <w:t xml:space="preserve">, you should bring a copy for the </w:t>
       </w:r>
       <w:r>
         <w:t>judge</w:t>
@@ -1661,7 +1793,7 @@
       <w:r>
         <w:t>(</w:t>
       </w:r>
-      <w:hyperlink r:id="rId19" w:history="1">
+      <w:hyperlink r:id="rId18" w:history="1">
         <w:r>
           <w:rPr>
             <w:rStyle w:val="Hyperlink"/>
@@ -1682,6 +1814,7 @@
         </w:numPr>
       </w:pPr>
       <w:r>
+        <w:lastRenderedPageBreak/>
         <w:t>m</w:t>
       </w:r>
       <w:r>
@@ -1703,7 +1836,15 @@
         <w:t xml:space="preserve">Certificate of Service </w:t>
       </w:r>
       <w:r>
-        <w:t xml:space="preserve">to show that you mailed it to the defendant, and file the Certificate of Service </w:t>
+        <w:t xml:space="preserve">to show that you mailed it to the defendant, and </w:t>
+      </w:r>
+      <w:proofErr w:type="gramStart"/>
+      <w:r>
+        <w:t>file</w:t>
+      </w:r>
+      <w:proofErr w:type="gramEnd"/>
+      <w:r>
+        <w:t xml:space="preserve"> the Certificate of Service </w:t>
       </w:r>
       <w:r>
         <w:t>with the court.</w:t>
@@ -1711,7 +1852,6 @@
     </w:p>
     <w:p>
       <w:r>
-        <w:lastRenderedPageBreak/>
         <w:t xml:space="preserve">The judge may dismiss your case if </w:t>
       </w:r>
       <w:r>
@@ -1746,7 +1886,7 @@
       <w:r>
         <w:t xml:space="preserve">The Vermont Judiciary has a Guide to Small Claims Proceedings: </w:t>
       </w:r>
-      <w:hyperlink r:id="rId20" w:history="1">
+      <w:hyperlink r:id="rId19" w:history="1">
         <w:r>
           <w:rPr>
             <w:rStyle w:val="Hyperlink"/>
@@ -1828,7 +1968,7 @@
       <w:r>
         <w:t xml:space="preserve">If you have questions about forms or the court process, contact the Vermont Judiciary Access and Resource Center (ARC) at </w:t>
       </w:r>
-      <w:hyperlink r:id="rId21" w:history="1">
+      <w:hyperlink r:id="rId20" w:history="1">
         <w:r>
           <w:rPr>
             <w:rStyle w:val="Hyperlink"/>
@@ -1903,7 +2043,7 @@
       <w:r>
         <w:t xml:space="preserve"> the Vermont Judiciary website: </w:t>
       </w:r>
-      <w:hyperlink r:id="rId22" w:history="1">
+      <w:hyperlink r:id="rId21" w:history="1">
         <w:r>
           <w:rPr>
             <w:rStyle w:val="Hyperlink"/>
@@ -1936,10 +2076,7 @@
         <w:t>-</w:t>
       </w:r>
       <w:r>
-        <w:t xml:space="preserve">fee consultation, contact the Vermont Bar Association’s Lawyer Referral </w:t>
-      </w:r>
-      <w:r>
-        <w:t>Service at 1-800-639-7036</w:t>
+        <w:t>fee consultation, contact the Vermont Bar Association’s Lawyer Referral Service at 1-800-639-7036</w:t>
       </w:r>
       <w:r>
         <w:t xml:space="preserve"> or </w:t>
@@ -1975,7 +2112,7 @@
       <w:r>
         <w:t xml:space="preserve"> VTLawHelp.org website: </w:t>
       </w:r>
-      <w:hyperlink r:id="rId23" w:history="1">
+      <w:hyperlink r:id="rId22" w:history="1">
         <w:r>
           <w:rPr>
             <w:rStyle w:val="Hyperlink"/>
@@ -2029,7 +2166,7 @@
                     <pic:cNvPicPr/>
                   </pic:nvPicPr>
                   <pic:blipFill rotWithShape="1">
-                    <a:blip r:embed="rId24" cstate="print">
+                    <a:blip r:embed="rId23" cstate="print">
                       <a:extLst>
                         <a:ext uri="{28A0092B-C50C-407E-A947-70E740481C1C}">
                           <a14:useLocalDpi xmlns:a14="http://schemas.microsoft.com/office/drawing/2010/main" val="0"/>
@@ -2113,7 +2250,6 @@
         <w:docPartUnique/>
       </w:docPartObj>
     </w:sdtPr>
-    <w:sdtEndPr/>
     <w:sdtContent>
       <w:sdt>
         <w:sdtPr>
@@ -2123,7 +2259,6 @@
             <w:docPartUnique/>
           </w:docPartObj>
         </w:sdtPr>
-        <w:sdtEndPr/>
         <w:sdtContent>
           <w:p>
             <w:pPr>
@@ -2263,7 +2398,6 @@
         <w:docPartUnique/>
       </w:docPartObj>
     </w:sdtPr>
-    <w:sdtEndPr/>
     <w:sdtContent>
       <w:sdt>
         <w:sdtPr>
@@ -2273,7 +2407,6 @@
             <w:docPartUnique/>
           </w:docPartObj>
         </w:sdtPr>
-        <w:sdtEndPr/>
         <w:sdtContent>
           <w:p>
             <w:pPr>

</xml_diff>

<commit_message>
another Next Steps update
</commit_message>
<xml_diff>
--- a/docassemble/VTSmallClaimsComplaint/data/templates/small_claims_complaint_next_steps.docx
+++ b/docassemble/VTSmallClaimsComplaint/data/templates/small_claims_complaint_next_steps.docx
@@ -92,13 +92,8 @@
       <w:r>
         <w:t xml:space="preserve"> </w:t>
       </w:r>
-      <w:proofErr w:type="gramStart"/>
-      <w:r>
-        <w:t>Now</w:t>
-      </w:r>
-      <w:proofErr w:type="gramEnd"/>
-      <w:r>
-        <w:t xml:space="preserve"> l</w:t>
+      <w:r>
+        <w:t>Now l</w:t>
       </w:r>
       <w:r>
         <w:t>earn what to do next.</w:t>
@@ -332,15 +327,7 @@
         </w:numPr>
       </w:pPr>
       <w:r>
-        <w:t xml:space="preserve">the court finds you can't pay the fee without expending </w:t>
-      </w:r>
-      <w:proofErr w:type="gramStart"/>
-      <w:r>
-        <w:t>resources</w:t>
-      </w:r>
-      <w:proofErr w:type="gramEnd"/>
-      <w:r>
-        <w:t xml:space="preserve"> needed to support you and your dependents</w:t>
+        <w:t>the court finds you can't pay the fee without expending resources needed to support you and your dependents</w:t>
       </w:r>
       <w:r>
         <w:t>.</w:t>
@@ -574,23 +561,7 @@
     </w:p>
     <w:p>
       <w:r>
-        <w:t xml:space="preserve">If you </w:t>
-      </w:r>
-      <w:proofErr w:type="gramStart"/>
-      <w:r>
-        <w:t>email</w:t>
-      </w:r>
-      <w:proofErr w:type="gramEnd"/>
-      <w:r>
-        <w:t xml:space="preserve"> the packet, be sure to call the courthouse to be sure they </w:t>
-      </w:r>
-      <w:proofErr w:type="gramStart"/>
-      <w:r>
-        <w:t>got</w:t>
-      </w:r>
-      <w:proofErr w:type="gramEnd"/>
-      <w:r>
-        <w:t xml:space="preserve"> it.</w:t>
+        <w:t>If you email the packet, be sure to call the courthouse to be sure they got it.</w:t>
       </w:r>
     </w:p>
     <w:p>
@@ -670,13 +641,8 @@
         <w:t xml:space="preserve"> the court </w:t>
       </w:r>
       <w:r>
-        <w:t xml:space="preserve">where you said your case </w:t>
-      </w:r>
-      <w:proofErr w:type="gramStart"/>
-      <w:r>
-        <w:t>is</w:t>
-      </w:r>
-      <w:proofErr w:type="gramEnd"/>
+        <w:t>where you said your case is</w:t>
+      </w:r>
       <w:r>
         <w:t>:</w:t>
       </w:r>
@@ -929,15 +895,7 @@
         <w:t xml:space="preserve">to </w:t>
       </w:r>
       <w:r>
-        <w:t xml:space="preserve">send </w:t>
-      </w:r>
-      <w:proofErr w:type="gramStart"/>
-      <w:r>
-        <w:t>papers</w:t>
-      </w:r>
-      <w:proofErr w:type="gramEnd"/>
-      <w:r>
-        <w:t xml:space="preserve"> </w:t>
+        <w:t xml:space="preserve">send papers </w:t>
       </w:r>
       <w:r>
         <w:t xml:space="preserve">back </w:t>
@@ -1364,23 +1322,6 @@
     <w:p>
       <w:pPr>
         <w:rPr>
-          <w:b/>
-          <w:bCs/>
-          <w:lang w:val="en-GB"/>
-        </w:rPr>
-      </w:pPr>
-      <w:r>
-        <w:rPr>
-          <w:b/>
-          <w:bCs/>
-          <w:lang w:val="en-GB"/>
-        </w:rPr>
-        <w:t>Serve the other party by mail</w:t>
-      </w:r>
-    </w:p>
-    <w:p>
-      <w:pPr>
-        <w:rPr>
           <w:lang w:val="en-GB"/>
         </w:rPr>
       </w:pPr>
@@ -1396,6 +1337,63 @@
         </w:rPr>
         <w:t xml:space="preserve"> to send those documents.</w:t>
       </w:r>
+    </w:p>
+    <w:p>
+      <w:pPr>
+        <w:pStyle w:val="Heading2"/>
+        <w:rPr>
+          <w:lang w:val="en-GB"/>
+        </w:rPr>
+      </w:pPr>
+      <w:r>
+        <w:rPr>
+          <w:lang w:val="en-GB"/>
+        </w:rPr>
+        <w:t>Send the court your Certificate of Service form</w:t>
+      </w:r>
+    </w:p>
+    <w:p>
+      <w:pPr>
+        <w:rPr>
+          <w:lang w:val="en-GB"/>
+        </w:rPr>
+      </w:pPr>
+      <w:r>
+        <w:rPr>
+          <w:lang w:val="en-GB"/>
+        </w:rPr>
+        <w:t xml:space="preserve">You </w:t>
+      </w:r>
+      <w:r>
+        <w:rPr>
+          <w:lang w:val="en-GB"/>
+        </w:rPr>
+        <w:t xml:space="preserve">then </w:t>
+      </w:r>
+      <w:r>
+        <w:rPr>
+          <w:lang w:val="en-GB"/>
+        </w:rPr>
+        <w:t xml:space="preserve">need to show the court that you served the other party. Do this by </w:t>
+      </w:r>
+      <w:r>
+        <w:rPr>
+          <w:lang w:val="en-GB"/>
+        </w:rPr>
+        <w:t xml:space="preserve">sending </w:t>
+      </w:r>
+      <w:r>
+        <w:rPr>
+          <w:lang w:val="en-GB"/>
+        </w:rPr>
+        <w:t>the court your</w:t>
+      </w:r>
+      <w:r>
+        <w:rPr>
+          <w:lang w:val="en-GB"/>
+        </w:rPr>
+        <w:t xml:space="preserve"> completed</w:t>
+      </w:r>
       <w:r>
         <w:rPr>
           <w:lang w:val="en-GB"/>
@@ -1406,96 +1404,111 @@
         <w:rPr>
           <w:lang w:val="en-GB"/>
         </w:rPr>
+        <w:t>small claims</w:t>
+      </w:r>
+      <w:r>
+        <w:rPr>
+          <w:lang w:val="en-GB"/>
+        </w:rPr>
+        <w:t xml:space="preserve"> Certificate of Service form</w:t>
+      </w:r>
+      <w:r>
+        <w:rPr>
+          <w:lang w:val="en-GB"/>
+        </w:rPr>
+        <w:t>.</w:t>
+      </w:r>
+    </w:p>
+    <w:p>
+      <w:pPr>
+        <w:rPr>
+          <w:lang w:val="en-GB"/>
+        </w:rPr>
+      </w:pPr>
+      <w:r>
+        <w:rPr>
+          <w:lang w:val="en-GB"/>
+        </w:rPr>
         <w:t xml:space="preserve">You </w:t>
       </w:r>
       <w:r>
         <w:rPr>
           <w:lang w:val="en-GB"/>
         </w:rPr>
-        <w:t xml:space="preserve">then </w:t>
-      </w:r>
-      <w:r>
-        <w:rPr>
-          <w:lang w:val="en-GB"/>
-        </w:rPr>
-        <w:t xml:space="preserve">need to show the court that you served the other party. Do this by filling out </w:t>
-      </w:r>
-      <w:r>
-        <w:rPr>
-          <w:lang w:val="en-GB"/>
-        </w:rPr>
-        <w:t xml:space="preserve">a </w:t>
-      </w:r>
-      <w:r>
-        <w:rPr>
-          <w:lang w:val="en-GB"/>
-        </w:rPr>
-        <w:t>small claims</w:t>
-      </w:r>
-      <w:r>
-        <w:rPr>
-          <w:lang w:val="en-GB"/>
-        </w:rPr>
-        <w:t xml:space="preserve"> Certificate of Service form</w:t>
-      </w:r>
-      <w:r>
-        <w:rPr>
-          <w:lang w:val="en-GB"/>
-        </w:rPr>
-        <w:t xml:space="preserve">. </w:t>
-      </w:r>
-      <w:r>
-        <w:rPr>
-          <w:lang w:val="en-GB"/>
-        </w:rPr>
-        <w:t>Then send it to the court.</w:t>
-      </w:r>
-    </w:p>
-    <w:p>
-      <w:r>
-        <w:t xml:space="preserve">If the defendant does not answer within 30 days from the date that you mailed the forms, you must </w:t>
-      </w:r>
-      <w:r>
-        <w:t xml:space="preserve">then </w:t>
-      </w:r>
-      <w:r>
-        <w:t>serve the defendant by sheriff.</w:t>
-      </w:r>
-    </w:p>
-    <w:p>
-      <w:pPr>
-        <w:rPr>
-          <w:b/>
-          <w:bCs/>
-        </w:rPr>
-      </w:pPr>
-      <w:r>
-        <w:rPr>
-          <w:b/>
-          <w:bCs/>
-        </w:rPr>
-        <w:t>If needed, use a</w:t>
-      </w:r>
-      <w:r>
-        <w:rPr>
-          <w:b/>
-          <w:bCs/>
-        </w:rPr>
+        <w:t>should have downloaded a form that was mostly filled out for you. Be sur</w:t>
+      </w:r>
+      <w:r>
+        <w:rPr>
+          <w:lang w:val="en-GB"/>
+        </w:rPr>
+        <w:t>e</w:t>
+      </w:r>
+      <w:r>
+        <w:rPr>
+          <w:lang w:val="en-GB"/>
+        </w:rPr>
+        <w:t xml:space="preserve"> to add the case number at the top</w:t>
+      </w:r>
+      <w:r>
+        <w:rPr>
+          <w:lang w:val="en-GB"/>
+        </w:rPr>
+        <w:t>,</w:t>
+      </w:r>
+      <w:r>
+        <w:rPr>
+          <w:lang w:val="en-GB"/>
+        </w:rPr>
+        <w:t xml:space="preserve"> your signature and the date</w:t>
+      </w:r>
+      <w:r>
+        <w:rPr>
+          <w:lang w:val="en-GB"/>
+        </w:rPr>
+        <w:t>s</w:t>
+      </w:r>
+      <w:r>
+        <w:rPr>
+          <w:lang w:val="en-GB"/>
+        </w:rPr>
+        <w:t>.</w:t>
+      </w:r>
+    </w:p>
+    <w:p>
+      <w:pPr>
+        <w:pStyle w:val="Heading2"/>
+      </w:pPr>
+      <w:r>
+        <w:t xml:space="preserve">If </w:t>
+      </w:r>
+      <w:r>
+        <w:t>no reply from defendant</w:t>
+      </w:r>
+      <w:r>
+        <w:t>, use a</w:t>
+      </w:r>
+      <w:r>
         <w:t xml:space="preserve"> </w:t>
       </w:r>
       <w:r>
-        <w:rPr>
-          <w:b/>
-          <w:bCs/>
-        </w:rPr>
         <w:t>s</w:t>
       </w:r>
       <w:r>
-        <w:rPr>
-          <w:b/>
-          <w:bCs/>
-        </w:rPr>
         <w:t>heriff</w:t>
+      </w:r>
+      <w:r>
+        <w:t xml:space="preserve"> to serve them</w:t>
+      </w:r>
+    </w:p>
+    <w:p>
+      <w:r>
+        <w:t xml:space="preserve">If the defendant does not answer </w:t>
+      </w:r>
+      <w:r>
+        <w:t xml:space="preserve">your complaint </w:t>
+      </w:r>
+      <w:r>
+        <w:t>within 30 days from the date that you mailed the forms, you must then serve the defendant by sheriff.</w:t>
       </w:r>
     </w:p>
     <w:p>
@@ -1561,7 +1574,10 @@
         <w:t xml:space="preserve">. The cost is usually </w:t>
       </w:r>
       <w:r>
-        <w:t>$75 to about $100. The sheriff may ask for a deposit to cover the fee.</w:t>
+        <w:t xml:space="preserve">$75 to about $100. </w:t>
+      </w:r>
+      <w:r>
+        <w:t>The sheriff may ask for a deposit to cover the fee.</w:t>
       </w:r>
     </w:p>
     <w:p>
@@ -1676,31 +1692,7 @@
     </w:p>
     <w:p>
       <w:r>
-        <w:t xml:space="preserve">At the hearing, you should come prepared to present your side of the case. You should bring </w:t>
-      </w:r>
-      <w:proofErr w:type="gramStart"/>
-      <w:r>
-        <w:t>any</w:t>
-      </w:r>
-      <w:proofErr w:type="gramEnd"/>
-      <w:r>
-        <w:t xml:space="preserve"> people, </w:t>
-      </w:r>
-      <w:proofErr w:type="gramStart"/>
-      <w:r>
-        <w:t>papers</w:t>
-      </w:r>
-      <w:proofErr w:type="gramEnd"/>
-      <w:r>
-        <w:t xml:space="preserve"> or anything else that might help your case. If you bring </w:t>
-      </w:r>
-      <w:proofErr w:type="gramStart"/>
-      <w:r>
-        <w:t>papers</w:t>
-      </w:r>
-      <w:proofErr w:type="gramEnd"/>
-      <w:r>
-        <w:t xml:space="preserve">, you should bring a copy for the </w:t>
+        <w:t xml:space="preserve">At the hearing, you should come prepared to present your side of the case. You should bring any people, papers or anything else that might help your case. If you bring papers, you should bring a copy for the </w:t>
       </w:r>
       <w:r>
         <w:t>judge</w:t>
@@ -1752,6 +1744,7 @@
         </w:numPr>
       </w:pPr>
       <w:r>
+        <w:lastRenderedPageBreak/>
         <w:t xml:space="preserve">send the court </w:t>
       </w:r>
       <w:r>
@@ -1814,7 +1807,6 @@
         </w:numPr>
       </w:pPr>
       <w:r>
-        <w:lastRenderedPageBreak/>
         <w:t>m</w:t>
       </w:r>
       <w:r>
@@ -1836,15 +1828,7 @@
         <w:t xml:space="preserve">Certificate of Service </w:t>
       </w:r>
       <w:r>
-        <w:t xml:space="preserve">to show that you mailed it to the defendant, and </w:t>
-      </w:r>
-      <w:proofErr w:type="gramStart"/>
-      <w:r>
-        <w:t>file</w:t>
-      </w:r>
-      <w:proofErr w:type="gramEnd"/>
-      <w:r>
-        <w:t xml:space="preserve"> the Certificate of Service </w:t>
+        <w:t xml:space="preserve">to show that you mailed it to the defendant, and file the Certificate of Service </w:t>
       </w:r>
       <w:r>
         <w:t>with the court.</w:t>
@@ -1966,7 +1950,10 @@
         </w:numPr>
       </w:pPr>
       <w:r>
-        <w:t xml:space="preserve">If you have questions about forms or the court process, contact the Vermont Judiciary Access and Resource Center (ARC) at </w:t>
+        <w:t xml:space="preserve">If you have questions about forms or the court process, contact the </w:t>
+      </w:r>
+      <w:r>
+        <w:t xml:space="preserve">Vermont Judiciary Access and Resource Center (ARC) at </w:t>
       </w:r>
       <w:hyperlink r:id="rId20" w:history="1">
         <w:r>

</xml_diff>

<commit_message>
made an edit on next steps doc (first subhead) and uploaded it
</commit_message>
<xml_diff>
--- a/docassemble/VTSmallClaimsComplaint/data/templates/small_claims_complaint_next_steps.docx
+++ b/docassemble/VTSmallClaimsComplaint/data/templates/small_claims_complaint_next_steps.docx
@@ -107,10 +107,10 @@
         <w:t>Next step</w:t>
       </w:r>
       <w:r>
-        <w:t xml:space="preserve"> – “file” your form</w:t>
-      </w:r>
-      <w:r>
-        <w:t>(s)</w:t>
+        <w:t xml:space="preserve"> – “file” your </w:t>
+      </w:r>
+      <w:r>
+        <w:t>Complaint</w:t>
       </w:r>
     </w:p>
     <w:p>

</xml_diff>

<commit_message>
another edit to next steps doc
</commit_message>
<xml_diff>
--- a/docassemble/VTSmallClaimsComplaint/data/templates/small_claims_complaint_next_steps.docx
+++ b/docassemble/VTSmallClaimsComplaint/data/templates/small_claims_complaint_next_steps.docx
@@ -10,8 +10,16 @@
         <w:rPr>
           <w:rStyle w:val="Heading1Char"/>
         </w:rPr>
-        <w:t>NEXT STEPS — VTCourtForms</w:t>
-      </w:r>
+        <w:t xml:space="preserve">NEXT STEPS — </w:t>
+      </w:r>
+      <w:proofErr w:type="spellStart"/>
+      <w:r>
+        <w:rPr>
+          <w:rStyle w:val="Heading1Char"/>
+        </w:rPr>
+        <w:t>VTCourtForms</w:t>
+      </w:r>
+      <w:proofErr w:type="spellEnd"/>
       <w:r>
         <w:br/>
       </w:r>
@@ -122,7 +130,15 @@
         </w:numPr>
       </w:pPr>
       <w:r>
-        <w:t>Download all the items in the VTCourtForms download screen.</w:t>
+        <w:t xml:space="preserve">Download all the items in the </w:t>
+      </w:r>
+      <w:proofErr w:type="spellStart"/>
+      <w:r>
+        <w:t>VTCourtForms</w:t>
+      </w:r>
+      <w:proofErr w:type="spellEnd"/>
+      <w:r>
+        <w:t xml:space="preserve"> download screen.</w:t>
       </w:r>
       <w:r>
         <w:t xml:space="preserve"> </w:t>
@@ -170,6 +186,9 @@
         <w:t xml:space="preserve">You can pay the court with cash, </w:t>
       </w:r>
       <w:r>
+        <w:t xml:space="preserve">credit card, </w:t>
+      </w:r>
+      <w:r>
         <w:t xml:space="preserve">money order or </w:t>
       </w:r>
       <w:r>
@@ -255,7 +274,15 @@
         <w:t>the</w:t>
       </w:r>
       <w:r>
-        <w:t xml:space="preserve"> VTCourtForms tool for the fee waiver form</w:t>
+        <w:t xml:space="preserve"> </w:t>
+      </w:r>
+      <w:proofErr w:type="spellStart"/>
+      <w:r>
+        <w:t>VTCourtForms</w:t>
+      </w:r>
+      <w:proofErr w:type="spellEnd"/>
+      <w:r>
+        <w:t xml:space="preserve"> tool for the fee waiver form</w:t>
       </w:r>
       <w:r>
         <w:t xml:space="preserve"> at </w:t>
@@ -602,8 +629,13 @@
       <w:r>
         <w:t xml:space="preserve"> if </w:t>
       </w:r>
-      <w:r>
-        <w:t xml:space="preserve">trial_court_division </w:t>
+      <w:proofErr w:type="spellStart"/>
+      <w:r>
+        <w:t>trial_court_division</w:t>
+      </w:r>
+      <w:proofErr w:type="spellEnd"/>
+      <w:r>
+        <w:t xml:space="preserve"> </w:t>
       </w:r>
       <w:r>
         <w:t>!</w:t>
@@ -660,36 +692,52 @@
           <w:b/>
           <w:bCs/>
         </w:rPr>
-        <w:t>{{ address_county }}</w:t>
-      </w:r>
+        <w:t xml:space="preserve">{{ </w:t>
+      </w:r>
+      <w:proofErr w:type="spellStart"/>
       <w:r>
         <w:rPr>
           <w:b/>
           <w:bCs/>
         </w:rPr>
-        <w:t xml:space="preserve"> </w:t>
-      </w:r>
+        <w:t>address_county</w:t>
+      </w:r>
+      <w:proofErr w:type="spellEnd"/>
       <w:r>
         <w:rPr>
           <w:b/>
           <w:bCs/>
         </w:rPr>
-        <w:t>Civil Division</w:t>
-      </w:r>
-    </w:p>
-    <w:p>
-      <w:pPr>
-        <w:spacing w:after="0"/>
+        <w:t xml:space="preserve"> }}</w:t>
+      </w:r>
+      <w:r>
         <w:rPr>
           <w:b/>
           <w:bCs/>
         </w:rPr>
-      </w:pPr>
+        <w:t xml:space="preserve"> </w:t>
+      </w:r>
       <w:r>
         <w:rPr>
           <w:b/>
           <w:bCs/>
         </w:rPr>
+        <w:t>Civil Division</w:t>
+      </w:r>
+    </w:p>
+    <w:p>
+      <w:pPr>
+        <w:spacing w:after="0"/>
+        <w:rPr>
+          <w:b/>
+          <w:bCs/>
+        </w:rPr>
+      </w:pPr>
+      <w:r>
+        <w:rPr>
+          <w:b/>
+          <w:bCs/>
+        </w:rPr>
         <w:t>Small Claims Court</w:t>
       </w:r>
     </w:p>
@@ -698,11 +746,51 @@
         <w:spacing w:after="0"/>
       </w:pPr>
       <w:r>
-        <w:t>{{ address_address }} {{ address_unit }}</w:t>
+        <w:t xml:space="preserve">{{ </w:t>
+      </w:r>
+      <w:proofErr w:type="spellStart"/>
+      <w:r>
+        <w:t>address_address</w:t>
+      </w:r>
+      <w:proofErr w:type="spellEnd"/>
+      <w:r>
+        <w:t xml:space="preserve"> }} {{ </w:t>
+      </w:r>
+      <w:proofErr w:type="spellStart"/>
+      <w:r>
+        <w:t>address_unit</w:t>
+      </w:r>
+      <w:proofErr w:type="spellEnd"/>
+      <w:r>
+        <w:t xml:space="preserve"> }}</w:t>
       </w:r>
       <w:r>
         <w:br/>
-        <w:t>{{ address_city }}, {{ address_state }} {{ address_zip }}</w:t>
+        <w:t xml:space="preserve">{{ </w:t>
+      </w:r>
+      <w:proofErr w:type="spellStart"/>
+      <w:r>
+        <w:t>address_city</w:t>
+      </w:r>
+      <w:proofErr w:type="spellEnd"/>
+      <w:r>
+        <w:t xml:space="preserve"> }}, {{ </w:t>
+      </w:r>
+      <w:proofErr w:type="spellStart"/>
+      <w:r>
+        <w:t>address_state</w:t>
+      </w:r>
+      <w:proofErr w:type="spellEnd"/>
+      <w:r>
+        <w:t xml:space="preserve"> }} {{ </w:t>
+      </w:r>
+      <w:proofErr w:type="spellStart"/>
+      <w:r>
+        <w:t>address_zip</w:t>
+      </w:r>
+      <w:proofErr w:type="spellEnd"/>
+      <w:r>
+        <w:t xml:space="preserve"> }}</w:t>
       </w:r>
     </w:p>
     <w:p>
@@ -711,7 +799,15 @@
       </w:pPr>
       <w:r>
         <w:br/>
-        <w:t>{% if arbitrary_attribute %}</w:t>
+        <w:t xml:space="preserve">{% if </w:t>
+      </w:r>
+      <w:proofErr w:type="spellStart"/>
+      <w:r>
+        <w:t>arbitrary_attribute</w:t>
+      </w:r>
+      <w:proofErr w:type="spellEnd"/>
+      <w:r>
+        <w:t xml:space="preserve"> %}</w:t>
       </w:r>
     </w:p>
     <w:p>
@@ -723,7 +819,15 @@
       </w:r>
       <w:r>
         <w:br/>
-        <w:t>{{ arbitrary_attribute }}</w:t>
+        <w:t xml:space="preserve">{{ </w:t>
+      </w:r>
+      <w:proofErr w:type="spellStart"/>
+      <w:r>
+        <w:t>arbitrary_attribute</w:t>
+      </w:r>
+      <w:proofErr w:type="spellEnd"/>
+      <w:r>
+        <w:t xml:space="preserve"> }}</w:t>
       </w:r>
     </w:p>
     <w:p>
@@ -780,8 +884,13 @@
       <w:r>
         <w:t xml:space="preserve"> if </w:t>
       </w:r>
-      <w:r>
-        <w:t xml:space="preserve">trial_court_division </w:t>
+      <w:proofErr w:type="spellStart"/>
+      <w:r>
+        <w:t>trial_court_division</w:t>
+      </w:r>
+      <w:proofErr w:type="spellEnd"/>
+      <w:r>
+        <w:t xml:space="preserve"> </w:t>
       </w:r>
       <w:r>
         <w:t>=</w:t>
@@ -1112,12 +1221,14 @@
         </w:rPr>
         <w:t xml:space="preserve">You should have downloaded some of these blank forms with </w:t>
       </w:r>
+      <w:proofErr w:type="spellStart"/>
       <w:r>
         <w:rPr>
           <w:lang w:val="en-GB"/>
         </w:rPr>
         <w:t>VTCourtForms</w:t>
       </w:r>
+      <w:proofErr w:type="spellEnd"/>
       <w:r>
         <w:rPr>
           <w:lang w:val="en-GB"/>
@@ -1574,10 +1685,7 @@
         <w:t xml:space="preserve">. The cost is usually </w:t>
       </w:r>
       <w:r>
-        <w:t xml:space="preserve">$75 to about $100. </w:t>
-      </w:r>
-      <w:r>
-        <w:t>The sheriff may ask for a deposit to cover the fee.</w:t>
+        <w:t>$75 to about $100. The sheriff may ask for a deposit to cover the fee.</w:t>
       </w:r>
     </w:p>
     <w:p>
@@ -1744,7 +1852,6 @@
         </w:numPr>
       </w:pPr>
       <w:r>
-        <w:lastRenderedPageBreak/>
         <w:t xml:space="preserve">send the court </w:t>
       </w:r>
       <w:r>
@@ -1950,10 +2057,7 @@
         </w:numPr>
       </w:pPr>
       <w:r>
-        <w:t xml:space="preserve">If you have questions about forms or the court process, contact the </w:t>
-      </w:r>
-      <w:r>
-        <w:t xml:space="preserve">Vermont Judiciary Access and Resource Center (ARC) at </w:t>
+        <w:t xml:space="preserve">If you have questions about forms or the court process, contact the Vermont Judiciary Access and Resource Center (ARC) at </w:t>
       </w:r>
       <w:hyperlink r:id="rId20" w:history="1">
         <w:r>
@@ -2237,6 +2341,7 @@
         <w:docPartUnique/>
       </w:docPartObj>
     </w:sdtPr>
+    <w:sdtEndPr/>
     <w:sdtContent>
       <w:sdt>
         <w:sdtPr>
@@ -2246,6 +2351,7 @@
             <w:docPartUnique/>
           </w:docPartObj>
         </w:sdtPr>
+        <w:sdtEndPr/>
         <w:sdtContent>
           <w:p>
             <w:pPr>
@@ -2385,6 +2491,7 @@
         <w:docPartUnique/>
       </w:docPartObj>
     </w:sdtPr>
+    <w:sdtEndPr/>
     <w:sdtContent>
       <w:sdt>
         <w:sdtPr>
@@ -2394,6 +2501,7 @@
             <w:docPartUnique/>
           </w:docPartObj>
         </w:sdtPr>
+        <w:sdtEndPr/>
         <w:sdtContent>
           <w:p>
             <w:pPr>

</xml_diff>

<commit_message>
various updates including new Next Steps doc
</commit_message>
<xml_diff>
--- a/docassemble/VTSmallClaimsComplaint/data/templates/small_claims_complaint_next_steps.docx
+++ b/docassemble/VTSmallClaimsComplaint/data/templates/small_claims_complaint_next_steps.docx
@@ -10,16 +10,8 @@
         <w:rPr>
           <w:rStyle w:val="Heading1Char"/>
         </w:rPr>
-        <w:t xml:space="preserve">NEXT STEPS — </w:t>
-      </w:r>
-      <w:proofErr w:type="spellStart"/>
-      <w:r>
-        <w:rPr>
-          <w:rStyle w:val="Heading1Char"/>
-        </w:rPr>
-        <w:t>VTCourtForms</w:t>
-      </w:r>
-      <w:proofErr w:type="spellEnd"/>
+        <w:t>NEXT STEPS — VTCourtForms</w:t>
+      </w:r>
       <w:r>
         <w:br/>
       </w:r>
@@ -100,8 +92,13 @@
       <w:r>
         <w:t xml:space="preserve"> </w:t>
       </w:r>
-      <w:r>
-        <w:t>Now l</w:t>
+      <w:proofErr w:type="gramStart"/>
+      <w:r>
+        <w:t>Now</w:t>
+      </w:r>
+      <w:proofErr w:type="gramEnd"/>
+      <w:r>
+        <w:t xml:space="preserve"> l</w:t>
       </w:r>
       <w:r>
         <w:t>earn what to do next.</w:t>
@@ -130,15 +127,7 @@
         </w:numPr>
       </w:pPr>
       <w:r>
-        <w:t xml:space="preserve">Download all the items in the </w:t>
-      </w:r>
-      <w:proofErr w:type="spellStart"/>
-      <w:r>
-        <w:t>VTCourtForms</w:t>
-      </w:r>
-      <w:proofErr w:type="spellEnd"/>
-      <w:r>
-        <w:t xml:space="preserve"> download screen.</w:t>
+        <w:t>Download all the items in the VTCourtForms download screen.</w:t>
       </w:r>
       <w:r>
         <w:t xml:space="preserve"> </w:t>
@@ -274,15 +263,7 @@
         <w:t>the</w:t>
       </w:r>
       <w:r>
-        <w:t xml:space="preserve"> </w:t>
-      </w:r>
-      <w:proofErr w:type="spellStart"/>
-      <w:r>
-        <w:t>VTCourtForms</w:t>
-      </w:r>
-      <w:proofErr w:type="spellEnd"/>
-      <w:r>
-        <w:t xml:space="preserve"> tool for the fee waiver form</w:t>
+        <w:t xml:space="preserve"> VTCourtForms tool for the fee waiver form</w:t>
       </w:r>
       <w:r>
         <w:t xml:space="preserve"> at </w:t>
@@ -588,7 +569,23 @@
     </w:p>
     <w:p>
       <w:r>
-        <w:t>If you email the packet, be sure to call the courthouse to be sure they got it.</w:t>
+        <w:t xml:space="preserve">If you </w:t>
+      </w:r>
+      <w:proofErr w:type="gramStart"/>
+      <w:r>
+        <w:t>email</w:t>
+      </w:r>
+      <w:proofErr w:type="gramEnd"/>
+      <w:r>
+        <w:t xml:space="preserve"> the packet, be sure to call the courthouse to be sure they </w:t>
+      </w:r>
+      <w:proofErr w:type="gramStart"/>
+      <w:r>
+        <w:t>got</w:t>
+      </w:r>
+      <w:proofErr w:type="gramEnd"/>
+      <w:r>
+        <w:t xml:space="preserve"> it.</w:t>
       </w:r>
     </w:p>
     <w:p>
@@ -629,52 +626,52 @@
       <w:r>
         <w:t xml:space="preserve"> if </w:t>
       </w:r>
-      <w:proofErr w:type="spellStart"/>
-      <w:r>
-        <w:t>trial_court_division</w:t>
-      </w:r>
-      <w:proofErr w:type="spellEnd"/>
+      <w:r>
+        <w:t xml:space="preserve">trial_court_division </w:t>
+      </w:r>
+      <w:r>
+        <w:t>!</w:t>
+      </w:r>
+      <w:r>
+        <w:t>= "</w:t>
+      </w:r>
+      <w:r>
+        <w:t>Unknown</w:t>
+      </w:r>
+      <w:r>
+        <w:t>"</w:t>
+      </w:r>
+      <w:r>
+        <w:t xml:space="preserve"> %}</w:t>
+      </w:r>
+    </w:p>
+    <w:p>
+      <w:pPr>
+        <w:spacing w:after="240"/>
+      </w:pPr>
+      <w:r>
+        <w:t>D</w:t>
+      </w:r>
+      <w:r>
+        <w:t>etails</w:t>
+      </w:r>
       <w:r>
         <w:t xml:space="preserve"> </w:t>
       </w:r>
       <w:r>
-        <w:t>!</w:t>
-      </w:r>
-      <w:r>
-        <w:t>= "</w:t>
-      </w:r>
-      <w:r>
-        <w:t>Unknown</w:t>
-      </w:r>
-      <w:r>
-        <w:t>"</w:t>
-      </w:r>
-      <w:r>
-        <w:t xml:space="preserve"> %}</w:t>
-      </w:r>
-    </w:p>
-    <w:p>
-      <w:pPr>
-        <w:spacing w:after="240"/>
-      </w:pPr>
-      <w:r>
-        <w:t>D</w:t>
-      </w:r>
-      <w:r>
-        <w:t>etails</w:t>
-      </w:r>
-      <w:r>
-        <w:t xml:space="preserve"> </w:t>
-      </w:r>
-      <w:r>
         <w:t>for</w:t>
       </w:r>
       <w:r>
         <w:t xml:space="preserve"> the court </w:t>
       </w:r>
       <w:r>
-        <w:t>where you said your case is</w:t>
-      </w:r>
+        <w:t xml:space="preserve">where you said your case </w:t>
+      </w:r>
+      <w:proofErr w:type="gramStart"/>
+      <w:r>
+        <w:t>is</w:t>
+      </w:r>
+      <w:proofErr w:type="gramEnd"/>
       <w:r>
         <w:t>:</w:t>
       </w:r>
@@ -692,105 +689,49 @@
           <w:b/>
           <w:bCs/>
         </w:rPr>
-        <w:t xml:space="preserve">{{ </w:t>
-      </w:r>
-      <w:proofErr w:type="spellStart"/>
+        <w:t>{{ address_county }}</w:t>
+      </w:r>
       <w:r>
         <w:rPr>
           <w:b/>
           <w:bCs/>
         </w:rPr>
-        <w:t>address_county</w:t>
-      </w:r>
-      <w:proofErr w:type="spellEnd"/>
+        <w:t xml:space="preserve"> </w:t>
+      </w:r>
       <w:r>
         <w:rPr>
           <w:b/>
           <w:bCs/>
         </w:rPr>
-        <w:t xml:space="preserve"> }}</w:t>
-      </w:r>
-      <w:r>
+        <w:t>Civil Division</w:t>
+      </w:r>
+    </w:p>
+    <w:p>
+      <w:pPr>
+        <w:spacing w:after="0"/>
         <w:rPr>
           <w:b/>
           <w:bCs/>
         </w:rPr>
-        <w:t xml:space="preserve"> </w:t>
-      </w:r>
+      </w:pPr>
       <w:r>
         <w:rPr>
           <w:b/>
           <w:bCs/>
         </w:rPr>
-        <w:t>Civil Division</w:t>
+        <w:t>Small Claims Court</w:t>
       </w:r>
     </w:p>
     <w:p>
       <w:pPr>
         <w:spacing w:after="0"/>
-        <w:rPr>
-          <w:b/>
-          <w:bCs/>
-        </w:rPr>
-      </w:pPr>
-      <w:r>
-        <w:rPr>
-          <w:b/>
-          <w:bCs/>
-        </w:rPr>
-        <w:t>Small Claims Court</w:t>
-      </w:r>
-    </w:p>
-    <w:p>
-      <w:pPr>
-        <w:spacing w:after="0"/>
-      </w:pPr>
-      <w:r>
-        <w:t xml:space="preserve">{{ </w:t>
-      </w:r>
-      <w:proofErr w:type="spellStart"/>
-      <w:r>
-        <w:t>address_address</w:t>
-      </w:r>
-      <w:proofErr w:type="spellEnd"/>
-      <w:r>
-        <w:t xml:space="preserve"> }} {{ </w:t>
-      </w:r>
-      <w:proofErr w:type="spellStart"/>
-      <w:r>
-        <w:t>address_unit</w:t>
-      </w:r>
-      <w:proofErr w:type="spellEnd"/>
-      <w:r>
-        <w:t xml:space="preserve"> }}</w:t>
+      </w:pPr>
+      <w:r>
+        <w:t>{{ address_address }} {{ address_unit }}</w:t>
       </w:r>
       <w:r>
         <w:br/>
-        <w:t xml:space="preserve">{{ </w:t>
-      </w:r>
-      <w:proofErr w:type="spellStart"/>
-      <w:r>
-        <w:t>address_city</w:t>
-      </w:r>
-      <w:proofErr w:type="spellEnd"/>
-      <w:r>
-        <w:t xml:space="preserve"> }}, {{ </w:t>
-      </w:r>
-      <w:proofErr w:type="spellStart"/>
-      <w:r>
-        <w:t>address_state</w:t>
-      </w:r>
-      <w:proofErr w:type="spellEnd"/>
-      <w:r>
-        <w:t xml:space="preserve"> }} {{ </w:t>
-      </w:r>
-      <w:proofErr w:type="spellStart"/>
-      <w:r>
-        <w:t>address_zip</w:t>
-      </w:r>
-      <w:proofErr w:type="spellEnd"/>
-      <w:r>
-        <w:t xml:space="preserve"> }}</w:t>
+        <w:t>{{ address_city }}, {{ address_state }} {{ address_zip }}</w:t>
       </w:r>
     </w:p>
     <w:p>
@@ -799,15 +740,7 @@
       </w:pPr>
       <w:r>
         <w:br/>
-        <w:t xml:space="preserve">{% if </w:t>
-      </w:r>
-      <w:proofErr w:type="spellStart"/>
-      <w:r>
-        <w:t>arbitrary_attribute</w:t>
-      </w:r>
-      <w:proofErr w:type="spellEnd"/>
-      <w:r>
-        <w:t xml:space="preserve"> %}</w:t>
+        <w:t>{% if arbitrary_attribute %}</w:t>
       </w:r>
     </w:p>
     <w:p>
@@ -819,15 +752,7 @@
       </w:r>
       <w:r>
         <w:br/>
-        <w:t xml:space="preserve">{{ </w:t>
-      </w:r>
-      <w:proofErr w:type="spellStart"/>
-      <w:r>
-        <w:t>arbitrary_attribute</w:t>
-      </w:r>
-      <w:proofErr w:type="spellEnd"/>
-      <w:r>
-        <w:t xml:space="preserve"> }}</w:t>
+        <w:t>{{ arbitrary_attribute }}</w:t>
       </w:r>
     </w:p>
     <w:p>
@@ -884,13 +809,8 @@
       <w:r>
         <w:t xml:space="preserve"> if </w:t>
       </w:r>
-      <w:proofErr w:type="spellStart"/>
-      <w:r>
-        <w:t>trial_court_division</w:t>
-      </w:r>
-      <w:proofErr w:type="spellEnd"/>
-      <w:r>
-        <w:t xml:space="preserve"> </w:t>
+      <w:r>
+        <w:t xml:space="preserve">trial_court_division </w:t>
       </w:r>
       <w:r>
         <w:t>=</w:t>
@@ -1176,22 +1096,36 @@
         <w:rPr>
           <w:lang w:val="en-GB"/>
         </w:rPr>
-        <w:t>, you must “serve</w:t>
-      </w:r>
-      <w:r>
-        <w:rPr>
+        <w:t xml:space="preserve">, </w:t>
+      </w:r>
+      <w:r>
+        <w:rPr>
+          <w:b/>
+          <w:bCs/>
+          <w:lang w:val="en-GB"/>
+        </w:rPr>
+        <w:t>you must “serve</w:t>
+      </w:r>
+      <w:r>
+        <w:rPr>
+          <w:b/>
+          <w:bCs/>
           <w:lang w:val="en-GB"/>
         </w:rPr>
         <w:t>”</w:t>
       </w:r>
       <w:r>
         <w:rPr>
+          <w:b/>
+          <w:bCs/>
           <w:lang w:val="en-GB"/>
         </w:rPr>
         <w:t xml:space="preserve"> the </w:t>
       </w:r>
       <w:r>
         <w:rPr>
+          <w:b/>
+          <w:bCs/>
           <w:lang w:val="en-GB"/>
         </w:rPr>
         <w:t>other party in the case</w:t>
@@ -1219,16 +1153,28 @@
         <w:rPr>
           <w:lang w:val="en-GB"/>
         </w:rPr>
-        <w:t xml:space="preserve">You should have downloaded some of these blank forms with </w:t>
-      </w:r>
-      <w:proofErr w:type="spellStart"/>
+        <w:t xml:space="preserve">You should have downloaded </w:t>
+      </w:r>
+      <w:proofErr w:type="gramStart"/>
+      <w:r>
+        <w:rPr>
+          <w:lang w:val="en-GB"/>
+        </w:rPr>
+        <w:t>some of</w:t>
+      </w:r>
+      <w:proofErr w:type="gramEnd"/>
+      <w:r>
+        <w:rPr>
+          <w:lang w:val="en-GB"/>
+        </w:rPr>
+        <w:t xml:space="preserve"> these blank forms with </w:t>
+      </w:r>
       <w:r>
         <w:rPr>
           <w:lang w:val="en-GB"/>
         </w:rPr>
         <w:t>VTCourtForms</w:t>
       </w:r>
-      <w:proofErr w:type="spellEnd"/>
       <w:r>
         <w:rPr>
           <w:lang w:val="en-GB"/>
@@ -1460,8 +1406,16 @@
         <w:rPr>
           <w:lang w:val="en-GB"/>
         </w:rPr>
-        <w:t>Send the court your Certificate of Service form</w:t>
-      </w:r>
+        <w:t xml:space="preserve">Send the court your Certificate of Service </w:t>
+      </w:r>
+      <w:proofErr w:type="gramStart"/>
+      <w:r>
+        <w:rPr>
+          <w:lang w:val="en-GB"/>
+        </w:rPr>
+        <w:t>form</w:t>
+      </w:r>
+      <w:proofErr w:type="gramEnd"/>
     </w:p>
     <w:p>
       <w:pPr>
@@ -1546,7 +1500,21 @@
         <w:rPr>
           <w:lang w:val="en-GB"/>
         </w:rPr>
-        <w:t>should have downloaded a form that was mostly filled out for you. Be sur</w:t>
+        <w:t xml:space="preserve">should have downloaded a form that </w:t>
+      </w:r>
+      <w:proofErr w:type="gramStart"/>
+      <w:r>
+        <w:rPr>
+          <w:lang w:val="en-GB"/>
+        </w:rPr>
+        <w:t>was mostly filled</w:t>
+      </w:r>
+      <w:proofErr w:type="gramEnd"/>
+      <w:r>
+        <w:rPr>
+          <w:lang w:val="en-GB"/>
+        </w:rPr>
+        <w:t xml:space="preserve"> out for you. Be sur</w:t>
       </w:r>
       <w:r>
         <w:rPr>
@@ -1570,7 +1538,21 @@
         <w:rPr>
           <w:lang w:val="en-GB"/>
         </w:rPr>
-        <w:t xml:space="preserve"> your signature and the date</w:t>
+        <w:t xml:space="preserve"> your </w:t>
+      </w:r>
+      <w:proofErr w:type="gramStart"/>
+      <w:r>
+        <w:rPr>
+          <w:lang w:val="en-GB"/>
+        </w:rPr>
+        <w:t>signature</w:t>
+      </w:r>
+      <w:proofErr w:type="gramEnd"/>
+      <w:r>
+        <w:rPr>
+          <w:lang w:val="en-GB"/>
+        </w:rPr>
+        <w:t xml:space="preserve"> and the date</w:t>
       </w:r>
       <w:r>
         <w:rPr>
@@ -1592,8 +1574,13 @@
       <w:r>
         <w:t xml:space="preserve">If </w:t>
       </w:r>
-      <w:r>
-        <w:t>no reply from defendant</w:t>
+      <w:proofErr w:type="gramStart"/>
+      <w:r>
+        <w:t>no</w:t>
+      </w:r>
+      <w:proofErr w:type="gramEnd"/>
+      <w:r>
+        <w:t xml:space="preserve"> reply from defendant</w:t>
       </w:r>
       <w:r>
         <w:t>, use a</w:t>
@@ -1627,16 +1614,36 @@
         <w:t xml:space="preserve">Take the </w:t>
       </w:r>
       <w:r>
-        <w:t>documents – plus a R</w:t>
-      </w:r>
-      <w:r>
-        <w:t xml:space="preserve">eturn of </w:t>
-      </w:r>
-      <w:r>
-        <w:t>S</w:t>
-      </w:r>
-      <w:r>
-        <w:t xml:space="preserve">ervice form </w:t>
+        <w:t xml:space="preserve">documents – plus a </w:t>
+      </w:r>
+      <w:hyperlink r:id="rId17" w:history="1">
+        <w:r>
+          <w:rPr>
+            <w:rStyle w:val="Hyperlink"/>
+          </w:rPr>
+          <w:t>R</w:t>
+        </w:r>
+        <w:r>
+          <w:rPr>
+            <w:rStyle w:val="Hyperlink"/>
+          </w:rPr>
+          <w:t xml:space="preserve">eturn of </w:t>
+        </w:r>
+        <w:r>
+          <w:rPr>
+            <w:rStyle w:val="Hyperlink"/>
+          </w:rPr>
+          <w:t>S</w:t>
+        </w:r>
+        <w:r>
+          <w:rPr>
+            <w:rStyle w:val="Hyperlink"/>
+          </w:rPr>
+          <w:t>ervice form</w:t>
+        </w:r>
+      </w:hyperlink>
+      <w:r>
+        <w:t xml:space="preserve"> </w:t>
       </w:r>
       <w:r>
         <w:t xml:space="preserve">– to </w:t>
@@ -1659,7 +1666,7 @@
       <w:r>
         <w:t xml:space="preserve">: </w:t>
       </w:r>
-      <w:hyperlink r:id="rId17" w:anchor="departments" w:history="1">
+      <w:hyperlink r:id="rId18" w:anchor="departments" w:history="1">
         <w:r>
           <w:rPr>
             <w:rStyle w:val="Hyperlink"/>
@@ -1800,13 +1807,43 @@
     </w:p>
     <w:p>
       <w:r>
-        <w:t xml:space="preserve">At the hearing, you should come prepared to present your side of the case. You should bring any people, papers or anything else that might help your case. If you bring papers, you should bring a copy for the </w:t>
+        <w:t xml:space="preserve">At the hearing, you should come prepared to present your side of the case. You should bring </w:t>
+      </w:r>
+      <w:proofErr w:type="gramStart"/>
+      <w:r>
+        <w:t>any</w:t>
+      </w:r>
+      <w:proofErr w:type="gramEnd"/>
+      <w:r>
+        <w:t xml:space="preserve"> people, </w:t>
+      </w:r>
+      <w:proofErr w:type="gramStart"/>
+      <w:r>
+        <w:t>papers</w:t>
+      </w:r>
+      <w:proofErr w:type="gramEnd"/>
+      <w:r>
+        <w:t xml:space="preserve"> or anything else that might help your case. If you bring </w:t>
+      </w:r>
+      <w:proofErr w:type="gramStart"/>
+      <w:r>
+        <w:t>papers</w:t>
+      </w:r>
+      <w:proofErr w:type="gramEnd"/>
+      <w:r>
+        <w:t xml:space="preserve">, you should bring a copy for the </w:t>
       </w:r>
       <w:r>
         <w:t>judge</w:t>
       </w:r>
       <w:r>
-        <w:t xml:space="preserve"> and for the plaintiff.</w:t>
+        <w:t xml:space="preserve"> and for the </w:t>
+      </w:r>
+      <w:r>
+        <w:t>defendant</w:t>
+      </w:r>
+      <w:r>
+        <w:t>.</w:t>
       </w:r>
     </w:p>
     <w:p>
@@ -1893,7 +1930,7 @@
       <w:r>
         <w:t>(</w:t>
       </w:r>
-      <w:hyperlink r:id="rId18" w:history="1">
+      <w:hyperlink r:id="rId19" w:history="1">
         <w:r>
           <w:rPr>
             <w:rStyle w:val="Hyperlink"/>
@@ -1935,7 +1972,15 @@
         <w:t xml:space="preserve">Certificate of Service </w:t>
       </w:r>
       <w:r>
-        <w:t xml:space="preserve">to show that you mailed it to the defendant, and file the Certificate of Service </w:t>
+        <w:t xml:space="preserve">to show that you mailed it to the defendant, and </w:t>
+      </w:r>
+      <w:proofErr w:type="gramStart"/>
+      <w:r>
+        <w:t>file</w:t>
+      </w:r>
+      <w:proofErr w:type="gramEnd"/>
+      <w:r>
+        <w:t xml:space="preserve"> the Certificate of Service </w:t>
       </w:r>
       <w:r>
         <w:t>with the court.</w:t>
@@ -1977,7 +2022,7 @@
       <w:r>
         <w:t xml:space="preserve">The Vermont Judiciary has a Guide to Small Claims Proceedings: </w:t>
       </w:r>
-      <w:hyperlink r:id="rId19" w:history="1">
+      <w:hyperlink r:id="rId20" w:history="1">
         <w:r>
           <w:rPr>
             <w:rStyle w:val="Hyperlink"/>
@@ -2059,7 +2104,7 @@
       <w:r>
         <w:t xml:space="preserve">If you have questions about forms or the court process, contact the Vermont Judiciary Access and Resource Center (ARC) at </w:t>
       </w:r>
-      <w:hyperlink r:id="rId20" w:history="1">
+      <w:hyperlink r:id="rId21" w:history="1">
         <w:r>
           <w:rPr>
             <w:rStyle w:val="Hyperlink"/>
@@ -2134,7 +2179,7 @@
       <w:r>
         <w:t xml:space="preserve"> the Vermont Judiciary website: </w:t>
       </w:r>
-      <w:hyperlink r:id="rId21" w:history="1">
+      <w:hyperlink r:id="rId22" w:history="1">
         <w:r>
           <w:rPr>
             <w:rStyle w:val="Hyperlink"/>
@@ -2203,7 +2248,7 @@
       <w:r>
         <w:t xml:space="preserve"> VTLawHelp.org website: </w:t>
       </w:r>
-      <w:hyperlink r:id="rId22" w:history="1">
+      <w:hyperlink r:id="rId23" w:history="1">
         <w:r>
           <w:rPr>
             <w:rStyle w:val="Hyperlink"/>
@@ -2257,7 +2302,7 @@
                     <pic:cNvPicPr/>
                   </pic:nvPicPr>
                   <pic:blipFill rotWithShape="1">
-                    <a:blip r:embed="rId23" cstate="print">
+                    <a:blip r:embed="rId24" cstate="print">
                       <a:extLst>
                         <a:ext uri="{28A0092B-C50C-407E-A947-70E740481C1C}">
                           <a14:useLocalDpi xmlns:a14="http://schemas.microsoft.com/office/drawing/2010/main" val="0"/>

</xml_diff>

<commit_message>
more edits per R and updated Next Steps template
</commit_message>
<xml_diff>
--- a/docassemble/VTSmallClaimsComplaint/data/templates/small_claims_complaint_next_steps.docx
+++ b/docassemble/VTSmallClaimsComplaint/data/templates/small_claims_complaint_next_steps.docx
@@ -92,13 +92,8 @@
       <w:r>
         <w:t xml:space="preserve"> </w:t>
       </w:r>
-      <w:proofErr w:type="gramStart"/>
-      <w:r>
-        <w:t>Now</w:t>
-      </w:r>
-      <w:proofErr w:type="gramEnd"/>
-      <w:r>
-        <w:t xml:space="preserve"> l</w:t>
+      <w:r>
+        <w:t>Now l</w:t>
       </w:r>
       <w:r>
         <w:t>earn what to do next.</w:t>
@@ -569,23 +564,7 @@
     </w:p>
     <w:p>
       <w:r>
-        <w:t xml:space="preserve">If you </w:t>
-      </w:r>
-      <w:proofErr w:type="gramStart"/>
-      <w:r>
-        <w:t>email</w:t>
-      </w:r>
-      <w:proofErr w:type="gramEnd"/>
-      <w:r>
-        <w:t xml:space="preserve"> the packet, be sure to call the courthouse to be sure they </w:t>
-      </w:r>
-      <w:proofErr w:type="gramStart"/>
-      <w:r>
-        <w:t>got</w:t>
-      </w:r>
-      <w:proofErr w:type="gramEnd"/>
-      <w:r>
-        <w:t xml:space="preserve"> it.</w:t>
+        <w:t>If you email the packet, be sure to call the courthouse to be sure they got it.</w:t>
       </w:r>
     </w:p>
     <w:p>
@@ -665,13 +644,8 @@
         <w:t xml:space="preserve"> the court </w:t>
       </w:r>
       <w:r>
-        <w:t xml:space="preserve">where you said your case </w:t>
-      </w:r>
-      <w:proofErr w:type="gramStart"/>
-      <w:r>
-        <w:t>is</w:t>
-      </w:r>
-      <w:proofErr w:type="gramEnd"/>
+        <w:t>where you said your case is</w:t>
+      </w:r>
       <w:r>
         <w:t>:</w:t>
       </w:r>
@@ -1153,21 +1127,7 @@
         <w:rPr>
           <w:lang w:val="en-GB"/>
         </w:rPr>
-        <w:t xml:space="preserve">You should have downloaded </w:t>
-      </w:r>
-      <w:proofErr w:type="gramStart"/>
-      <w:r>
-        <w:rPr>
-          <w:lang w:val="en-GB"/>
-        </w:rPr>
-        <w:t>some of</w:t>
-      </w:r>
-      <w:proofErr w:type="gramEnd"/>
-      <w:r>
-        <w:rPr>
-          <w:lang w:val="en-GB"/>
-        </w:rPr>
-        <w:t xml:space="preserve"> these blank forms with </w:t>
+        <w:t xml:space="preserve">You should have downloaded some of these blank forms with </w:t>
       </w:r>
       <w:r>
         <w:rPr>
@@ -1228,6 +1188,12 @@
         <w:rPr>
           <w:lang w:val="en-GB"/>
         </w:rPr>
+        <w:t xml:space="preserve">a copy of </w:t>
+      </w:r>
+      <w:r>
+        <w:rPr>
+          <w:lang w:val="en-GB"/>
+        </w:rPr>
         <w:t xml:space="preserve">the Small Claims </w:t>
       </w:r>
       <w:r>
@@ -1406,16 +1372,8 @@
         <w:rPr>
           <w:lang w:val="en-GB"/>
         </w:rPr>
-        <w:t xml:space="preserve">Send the court your Certificate of Service </w:t>
-      </w:r>
-      <w:proofErr w:type="gramStart"/>
-      <w:r>
-        <w:rPr>
-          <w:lang w:val="en-GB"/>
-        </w:rPr>
-        <w:t>form</w:t>
-      </w:r>
-      <w:proofErr w:type="gramEnd"/>
+        <w:t>Send the court your Certificate of Service form</w:t>
+      </w:r>
     </w:p>
     <w:p>
       <w:pPr>
@@ -1500,21 +1458,7 @@
         <w:rPr>
           <w:lang w:val="en-GB"/>
         </w:rPr>
-        <w:t xml:space="preserve">should have downloaded a form that </w:t>
-      </w:r>
-      <w:proofErr w:type="gramStart"/>
-      <w:r>
-        <w:rPr>
-          <w:lang w:val="en-GB"/>
-        </w:rPr>
-        <w:t>was mostly filled</w:t>
-      </w:r>
-      <w:proofErr w:type="gramEnd"/>
-      <w:r>
-        <w:rPr>
-          <w:lang w:val="en-GB"/>
-        </w:rPr>
-        <w:t xml:space="preserve"> out for you. Be sur</w:t>
+        <w:t>should have downloaded a form that was mostly filled out for you. Be sur</w:t>
       </w:r>
       <w:r>
         <w:rPr>
@@ -1538,21 +1482,7 @@
         <w:rPr>
           <w:lang w:val="en-GB"/>
         </w:rPr>
-        <w:t xml:space="preserve"> your </w:t>
-      </w:r>
-      <w:proofErr w:type="gramStart"/>
-      <w:r>
-        <w:rPr>
-          <w:lang w:val="en-GB"/>
-        </w:rPr>
-        <w:t>signature</w:t>
-      </w:r>
-      <w:proofErr w:type="gramEnd"/>
-      <w:r>
-        <w:rPr>
-          <w:lang w:val="en-GB"/>
-        </w:rPr>
-        <w:t xml:space="preserve"> and the date</w:t>
+        <w:t xml:space="preserve"> your signature and the date</w:t>
       </w:r>
       <w:r>
         <w:rPr>
@@ -1574,13 +1504,8 @@
       <w:r>
         <w:t xml:space="preserve">If </w:t>
       </w:r>
-      <w:proofErr w:type="gramStart"/>
-      <w:r>
-        <w:t>no</w:t>
-      </w:r>
-      <w:proofErr w:type="gramEnd"/>
-      <w:r>
-        <w:t xml:space="preserve"> reply from defendant</w:t>
+      <w:r>
+        <w:t>no reply from defendant</w:t>
       </w:r>
       <w:r>
         <w:t>, use a</w:t>
@@ -1807,31 +1732,7 @@
     </w:p>
     <w:p>
       <w:r>
-        <w:t xml:space="preserve">At the hearing, you should come prepared to present your side of the case. You should bring </w:t>
-      </w:r>
-      <w:proofErr w:type="gramStart"/>
-      <w:r>
-        <w:t>any</w:t>
-      </w:r>
-      <w:proofErr w:type="gramEnd"/>
-      <w:r>
-        <w:t xml:space="preserve"> people, </w:t>
-      </w:r>
-      <w:proofErr w:type="gramStart"/>
-      <w:r>
-        <w:t>papers</w:t>
-      </w:r>
-      <w:proofErr w:type="gramEnd"/>
-      <w:r>
-        <w:t xml:space="preserve"> or anything else that might help your case. If you bring </w:t>
-      </w:r>
-      <w:proofErr w:type="gramStart"/>
-      <w:r>
-        <w:t>papers</w:t>
-      </w:r>
-      <w:proofErr w:type="gramEnd"/>
-      <w:r>
-        <w:t xml:space="preserve">, you should bring a copy for the </w:t>
+        <w:t xml:space="preserve">At the hearing, you should come prepared to present your side of the case. You should bring any people, papers or anything else that might help your case. If you bring papers, you should bring a copy for the </w:t>
       </w:r>
       <w:r>
         <w:t>judge</w:t>
@@ -1972,15 +1873,7 @@
         <w:t xml:space="preserve">Certificate of Service </w:t>
       </w:r>
       <w:r>
-        <w:t xml:space="preserve">to show that you mailed it to the defendant, and </w:t>
-      </w:r>
-      <w:proofErr w:type="gramStart"/>
-      <w:r>
-        <w:t>file</w:t>
-      </w:r>
-      <w:proofErr w:type="gramEnd"/>
-      <w:r>
-        <w:t xml:space="preserve"> the Certificate of Service </w:t>
+        <w:t xml:space="preserve">to show that you mailed it to the defendant, and file the Certificate of Service </w:t>
       </w:r>
       <w:r>
         <w:t>with the court.</w:t>

</xml_diff>